<commit_message>
Update content in uloha1.txt and remove outdated section from github_collaboration.docx
</commit_message>
<xml_diff>
--- a/Teoria/github_collaboration.docx
+++ b/Teoria/github_collaboration.docx
@@ -10,42 +10,24 @@
         </w:rPr>
       </w:pPr>
       <w:bookmarkStart w:id="0" w:name="_Toc242292774"/>
-      <w:proofErr w:type="spellStart"/>
-      <w:r>
-        <w:rPr>
-          <w:lang w:val="en-US"/>
-        </w:rPr>
-        <w:t>Github</w:t>
-      </w:r>
-      <w:proofErr w:type="spellEnd"/>
-      <w:r>
-        <w:rPr>
-          <w:lang w:val="en-US"/>
-        </w:rPr>
-        <w:t xml:space="preserve"> a </w:t>
-      </w:r>
-      <w:proofErr w:type="spellStart"/>
-      <w:r>
-        <w:rPr>
-          <w:lang w:val="en-US"/>
-        </w:rPr>
-        <w:t>žiak</w:t>
-      </w:r>
-      <w:proofErr w:type="spellEnd"/>
-      <w:r>
-        <w:rPr>
-          <w:lang w:val="en-US"/>
-        </w:rPr>
-        <w:t>.</w:t>
+      <w:r>
+        <w:rPr>
+          <w:lang w:val="en-US"/>
+        </w:rPr>
+        <w:t>Github a žiak.</w:t>
       </w:r>
       <w:bookmarkEnd w:id="0"/>
     </w:p>
     <w:sdt>
       <w:sdtPr>
         <w:rPr>
+          <w:rFonts w:asciiTheme="minorHAnsi" w:eastAsiaTheme="minorHAnsi" w:hAnsiTheme="minorHAnsi" w:cstheme="minorBidi"/>
           <w:color w:val="auto"/>
+          <w:kern w:val="2"/>
           <w:sz w:val="28"/>
           <w:szCs w:val="28"/>
+          <w:lang w:val="sk-SK"/>
+          <w14:ligatures w14:val="standardContextual"/>
         </w:rPr>
         <w:id w:val="-1699917460"/>
         <w:docPartObj>
@@ -55,15 +37,11 @@
       </w:sdtPr>
       <w:sdtEndPr>
         <w:rPr>
-          <w:rFonts w:asciiTheme="minorHAnsi" w:eastAsiaTheme="minorHAnsi" w:hAnsiTheme="minorHAnsi" w:cstheme="minorBidi"/>
           <w:b/>
           <w:bCs/>
           <w:noProof/>
-          <w:kern w:val="2"/>
           <w:sz w:val="24"/>
           <w:szCs w:val="24"/>
-          <w:lang w:val="sk-SK"/>
-          <w14:ligatures w14:val="standardContextual"/>
         </w:rPr>
       </w:sdtEndPr>
       <w:sdtContent>
@@ -77,7 +55,6 @@
               <w:szCs w:val="28"/>
             </w:rPr>
           </w:pPr>
-          <w:proofErr w:type="spellStart"/>
           <w:r>
             <w:rPr>
               <w:color w:val="auto"/>
@@ -86,7 +63,6 @@
             </w:rPr>
             <w:t>Obsah</w:t>
           </w:r>
-          <w:proofErr w:type="spellEnd"/>
         </w:p>
         <w:p>
           <w:pPr>
@@ -2194,49 +2170,7 @@
         <w:rPr>
           <w:lang w:val="en-US"/>
         </w:rPr>
-        <w:t xml:space="preserve">Ak </w:t>
-      </w:r>
-      <w:proofErr w:type="spellStart"/>
-      <w:r>
-        <w:rPr>
-          <w:lang w:val="en-US"/>
-        </w:rPr>
-        <w:t>pracuješ</w:t>
-      </w:r>
-      <w:proofErr w:type="spellEnd"/>
-      <w:r>
-        <w:rPr>
-          <w:lang w:val="en-US"/>
-        </w:rPr>
-        <w:t xml:space="preserve"> so </w:t>
-      </w:r>
-      <w:proofErr w:type="spellStart"/>
-      <w:r>
-        <w:rPr>
-          <w:lang w:val="en-US"/>
-        </w:rPr>
-        <w:t>študentom</w:t>
-      </w:r>
-      <w:proofErr w:type="spellEnd"/>
-      <w:r>
-        <w:rPr>
-          <w:lang w:val="en-US"/>
-        </w:rPr>
-        <w:t xml:space="preserve">, </w:t>
-      </w:r>
-      <w:proofErr w:type="spellStart"/>
-      <w:r>
-        <w:rPr>
-          <w:lang w:val="en-US"/>
-        </w:rPr>
-        <w:t>ktorý</w:t>
-      </w:r>
-      <w:proofErr w:type="spellEnd"/>
-      <w:r>
-        <w:rPr>
-          <w:lang w:val="en-US"/>
-        </w:rPr>
-        <w:t xml:space="preserve"> má </w:t>
+        <w:t xml:space="preserve">Ak pracuješ so študentom, ktorý má </w:t>
       </w:r>
       <w:r>
         <w:rPr>
@@ -2282,6 +2216,8 @@
         </w:rPr>
       </w:pPr>
       <w:bookmarkStart w:id="1" w:name="_Toc242292775"/>
+      <w:bookmarkStart w:id="2" w:name="dnes"/>
+      <w:bookmarkEnd w:id="2"/>
       <w:r>
         <w:rPr>
           <w:lang w:val="en-US"/>
@@ -2383,14 +2319,14 @@
           <w:lang w:val="en-US"/>
         </w:rPr>
       </w:pPr>
-      <w:bookmarkStart w:id="2" w:name="_Toc242292776"/>
+      <w:bookmarkStart w:id="3" w:name="_Toc242292776"/>
       <w:r>
         <w:rPr>
           <w:lang w:val="en-US"/>
         </w:rPr>
         <w:t>Ako spolupracovať so študentom, ktorý pracuje oddelene</w:t>
       </w:r>
-      <w:bookmarkEnd w:id="2"/>
+      <w:bookmarkEnd w:id="3"/>
     </w:p>
     <w:p>
       <w:pPr>
@@ -2399,14 +2335,14 @@
           <w:lang w:val="en-US"/>
         </w:rPr>
       </w:pPr>
-      <w:bookmarkStart w:id="3" w:name="_Toc242292777"/>
+      <w:bookmarkStart w:id="4" w:name="_Toc242292777"/>
       <w:r>
         <w:rPr>
           <w:lang w:val="en-US"/>
         </w:rPr>
         <w:t>Vytvor repozitár (alebo použite existujúci)</w:t>
       </w:r>
-      <w:bookmarkEnd w:id="3"/>
+      <w:bookmarkEnd w:id="4"/>
     </w:p>
     <w:p>
       <w:pPr>
@@ -2740,50 +2676,6 @@
           <w:bCs/>
           <w:lang w:val="en-US"/>
         </w:rPr>
-        <w:t>C) GitHub Classroom (ak učíš viac študentov)</w:t>
-      </w:r>
-    </w:p>
-    <w:p>
-      <w:pPr>
-        <w:rPr>
-          <w:lang w:val="en-US"/>
-        </w:rPr>
-      </w:pPr>
-      <w:r>
-        <w:rPr>
-          <w:lang w:val="en-US"/>
-        </w:rPr>
-        <w:t xml:space="preserve">GitHub Classroom automaticky vytvára </w:t>
-      </w:r>
-      <w:r>
-        <w:rPr>
-          <w:b/>
-          <w:bCs/>
-          <w:lang w:val="en-US"/>
-        </w:rPr>
-        <w:t>samostatné repozitáre pre každého študenta</w:t>
-      </w:r>
-      <w:r>
-        <w:rPr>
-          <w:lang w:val="en-US"/>
-        </w:rPr>
-        <w:t>. Toto je ideálne pri výučbe, kde každý študent má svoj priestor.</w:t>
-      </w:r>
-    </w:p>
-    <w:p>
-      <w:pPr>
-        <w:rPr>
-          <w:b/>
-          <w:bCs/>
-          <w:lang w:val="en-US"/>
-        </w:rPr>
-      </w:pPr>
-      <w:r>
-        <w:rPr>
-          <w:b/>
-          <w:bCs/>
-          <w:lang w:val="en-US"/>
-        </w:rPr>
         <w:t>Ako kontrolovať študentovu prácu</w:t>
       </w:r>
     </w:p>
@@ -2942,7 +2834,6 @@
         <w:rPr>
           <w:lang w:val="en-US"/>
         </w:rPr>
-        <w:lastRenderedPageBreak/>
         <w:t>komentuješ</w:t>
       </w:r>
     </w:p>
@@ -2990,6 +2881,7 @@
         <w:rPr>
           <w:lang w:val="en-US"/>
         </w:rPr>
+        <w:lastRenderedPageBreak/>
         <w:t xml:space="preserve">Ty vytvoríš </w:t>
       </w:r>
       <w:r>
@@ -3640,8 +3532,8 @@
                 <w:lang w:val="en-US"/>
               </w:rPr>
             </w:pPr>
-            <w:bookmarkStart w:id="4" w:name="Aktualne"/>
-            <w:bookmarkEnd w:id="4"/>
+            <w:bookmarkStart w:id="5" w:name="Aktualne"/>
+            <w:bookmarkEnd w:id="5"/>
             <w:r>
               <w:rPr>
                 <w:b/>
@@ -3678,44 +3570,22 @@
       <w:pPr>
         <w:pStyle w:val="Heading2"/>
       </w:pPr>
-      <w:bookmarkStart w:id="5" w:name="_Toc242292778"/>
+      <w:bookmarkStart w:id="6" w:name="_Toc242292778"/>
       <w:r>
         <w:t>Linky.</w:t>
       </w:r>
-      <w:bookmarkEnd w:id="5"/>
+      <w:bookmarkEnd w:id="6"/>
     </w:p>
     <w:p>
       <w:pPr>
         <w:spacing w:before="120"/>
       </w:pPr>
       <w:hyperlink r:id="rId8" w:history="1">
-        <w:proofErr w:type="spellStart"/>
         <w:r>
           <w:rPr>
             <w:rStyle w:val="Hyperlink"/>
           </w:rPr>
-          <w:t>Collaboration</w:t>
-        </w:r>
-        <w:proofErr w:type="spellEnd"/>
-        <w:r>
-          <w:rPr>
-            <w:rStyle w:val="Hyperlink"/>
-          </w:rPr>
-          <w:t xml:space="preserve"> </w:t>
-        </w:r>
-        <w:proofErr w:type="spellStart"/>
-        <w:r>
-          <w:rPr>
-            <w:rStyle w:val="Hyperlink"/>
-          </w:rPr>
-          <w:t>with</w:t>
-        </w:r>
-        <w:proofErr w:type="spellEnd"/>
-        <w:r>
-          <w:rPr>
-            <w:rStyle w:val="Hyperlink"/>
-          </w:rPr>
-          <w:t xml:space="preserve"> Git and GitHub</w:t>
+          <w:t>Collaboration with Git and GitHub</w:t>
         </w:r>
       </w:hyperlink>
     </w:p>
@@ -3746,34 +3616,14 @@
           <w:lang w:val="en-US"/>
         </w:rPr>
       </w:pPr>
-      <w:proofErr w:type="spellStart"/>
       <w:r>
         <w:rPr>
           <w:b/>
           <w:bCs/>
           <w:lang w:val="en-US"/>
         </w:rPr>
-        <w:t>Prehľad</w:t>
-      </w:r>
-      <w:proofErr w:type="spellEnd"/>
-      <w:r>
-        <w:rPr>
-          <w:b/>
-          <w:bCs/>
-          <w:lang w:val="en-US"/>
-        </w:rPr>
-        <w:t xml:space="preserve"> </w:t>
-      </w:r>
-      <w:proofErr w:type="spellStart"/>
-      <w:r>
-        <w:rPr>
-          <w:b/>
-          <w:bCs/>
-          <w:lang w:val="en-US"/>
-        </w:rPr>
-        <w:t>workflowu</w:t>
-      </w:r>
-      <w:proofErr w:type="spellEnd"/>
+        <w:t>Prehľad workflowu</w:t>
+      </w:r>
     </w:p>
     <w:tbl>
       <w:tblPr>
@@ -4196,7 +4046,6 @@
                 <w:bCs/>
                 <w:lang w:val="en-US"/>
               </w:rPr>
-              <w:lastRenderedPageBreak/>
               <w:t>Kontrola kódu</w:t>
             </w:r>
           </w:p>
@@ -4342,52 +4191,15 @@
           <w:lang w:val="en-US"/>
         </w:rPr>
       </w:pPr>
-      <w:proofErr w:type="spellStart"/>
       <w:r>
         <w:rPr>
           <w:b/>
           <w:bCs/>
           <w:lang w:val="en-US"/>
         </w:rPr>
-        <w:t>Príprava</w:t>
-      </w:r>
-      <w:proofErr w:type="spellEnd"/>
-      <w:r>
-        <w:rPr>
-          <w:b/>
-          <w:bCs/>
-          <w:lang w:val="en-US"/>
-        </w:rPr>
-        <w:t xml:space="preserve"> </w:t>
-      </w:r>
-      <w:proofErr w:type="spellStart"/>
-      <w:r>
-        <w:rPr>
-          <w:b/>
-          <w:bCs/>
-          <w:lang w:val="en-US"/>
-        </w:rPr>
-        <w:t>repozitára</w:t>
-      </w:r>
-      <w:proofErr w:type="spellEnd"/>
-      <w:r>
-        <w:rPr>
-          <w:b/>
-          <w:bCs/>
-          <w:lang w:val="en-US"/>
-        </w:rPr>
-        <w:t xml:space="preserve"> – </w:t>
-      </w:r>
-      <w:proofErr w:type="spellStart"/>
-      <w:r>
-        <w:rPr>
-          <w:b/>
-          <w:bCs/>
-          <w:lang w:val="en-US"/>
-        </w:rPr>
-        <w:t>učiteľ</w:t>
-      </w:r>
-      <w:proofErr w:type="spellEnd"/>
+        <w:lastRenderedPageBreak/>
+        <w:t>Príprava repozitára – učiteľ</w:t>
+      </w:r>
     </w:p>
     <w:p>
       <w:pPr>
@@ -4396,14 +4208,14 @@
           <w:lang w:val="en-US"/>
         </w:rPr>
       </w:pPr>
-      <w:bookmarkStart w:id="6" w:name="_Toc242292779"/>
+      <w:bookmarkStart w:id="7" w:name="_Toc242292779"/>
       <w:r>
         <w:rPr>
           <w:lang w:val="en-US"/>
         </w:rPr>
         <w:t>1. Vytvorenie repozitára</w:t>
       </w:r>
-      <w:bookmarkEnd w:id="6"/>
+      <w:bookmarkEnd w:id="7"/>
     </w:p>
     <w:p>
       <w:pPr>
@@ -4516,14 +4328,12 @@
         </w:rPr>
         <w:t xml:space="preserve"> napr. </w:t>
       </w:r>
-      <w:proofErr w:type="spellStart"/>
       <w:r>
         <w:rPr>
           <w:lang w:val="en-US"/>
         </w:rPr>
         <w:t>ITLearnJD</w:t>
       </w:r>
-      <w:proofErr w:type="spellEnd"/>
     </w:p>
     <w:p>
       <w:pPr>
@@ -4610,14 +4420,14 @@
           <w:lang w:val="en-US"/>
         </w:rPr>
       </w:pPr>
-      <w:bookmarkStart w:id="7" w:name="_Toc242292780"/>
+      <w:bookmarkStart w:id="8" w:name="_Toc242292780"/>
       <w:r>
         <w:rPr>
           <w:lang w:val="en-US"/>
         </w:rPr>
         <w:t>2. Základná štruktúra projektu</w:t>
       </w:r>
-      <w:bookmarkEnd w:id="7"/>
+      <w:bookmarkEnd w:id="8"/>
     </w:p>
     <w:p>
       <w:pPr>
@@ -4979,44 +4789,14 @@
           <w:lang w:val="en-US"/>
         </w:rPr>
       </w:pPr>
-      <w:bookmarkStart w:id="8" w:name="_Toc242292781"/>
-      <w:proofErr w:type="spellStart"/>
-      <w:r>
-        <w:rPr>
-          <w:lang w:val="en-US"/>
-        </w:rPr>
-        <w:t>Prvé</w:t>
-      </w:r>
-      <w:proofErr w:type="spellEnd"/>
-      <w:r>
-        <w:rPr>
-          <w:lang w:val="en-US"/>
-        </w:rPr>
-        <w:t xml:space="preserve"> </w:t>
-      </w:r>
-      <w:proofErr w:type="spellStart"/>
-      <w:r>
-        <w:rPr>
-          <w:lang w:val="en-US"/>
-        </w:rPr>
-        <w:t>pripojenie</w:t>
-      </w:r>
-      <w:proofErr w:type="spellEnd"/>
-      <w:r>
-        <w:rPr>
-          <w:lang w:val="en-US"/>
-        </w:rPr>
-        <w:t xml:space="preserve"> – </w:t>
-      </w:r>
-      <w:proofErr w:type="spellStart"/>
-      <w:r>
-        <w:rPr>
-          <w:lang w:val="en-US"/>
-        </w:rPr>
-        <w:t>študent</w:t>
-      </w:r>
-      <w:bookmarkEnd w:id="8"/>
-      <w:proofErr w:type="spellEnd"/>
+      <w:bookmarkStart w:id="9" w:name="_Toc242292781"/>
+      <w:r>
+        <w:rPr>
+          <w:lang w:val="en-US"/>
+        </w:rPr>
+        <w:t>Prvé pripojenie – študent</w:t>
+      </w:r>
+      <w:bookmarkEnd w:id="9"/>
     </w:p>
     <w:p>
       <w:pPr>
@@ -5025,14 +4805,14 @@
           <w:lang w:val="en-US"/>
         </w:rPr>
       </w:pPr>
-      <w:bookmarkStart w:id="9" w:name="_Toc242292782"/>
+      <w:bookmarkStart w:id="10" w:name="_Toc242292782"/>
       <w:r>
         <w:rPr>
           <w:lang w:val="en-US"/>
         </w:rPr>
         <w:t>1. Klonovanie repozitára</w:t>
       </w:r>
-      <w:bookmarkEnd w:id="9"/>
+      <w:bookmarkEnd w:id="10"/>
     </w:p>
     <w:p>
       <w:pPr>
@@ -5099,59 +4879,59 @@
         <w:rPr>
           <w:lang w:val="en-US"/>
         </w:rPr>
+        <w:t>V termináli:</w:t>
+      </w:r>
+    </w:p>
+    <w:p>
+      <w:pPr>
+        <w:rPr>
+          <w:lang w:val="en-US"/>
+        </w:rPr>
+      </w:pPr>
+      <w:r>
+        <w:rPr>
+          <w:lang w:val="en-US"/>
+        </w:rPr>
+        <w:t>bash</w:t>
+      </w:r>
+    </w:p>
+    <w:p>
+      <w:pPr>
+        <w:rPr>
+          <w:lang w:val="en-US"/>
+        </w:rPr>
+      </w:pPr>
+      <w:r>
+        <w:rPr>
+          <w:lang w:val="en-US"/>
+        </w:rPr>
+        <w:t>git clone https://github.com/tibor/programovanie-2026.git</w:t>
+      </w:r>
+    </w:p>
+    <w:p>
+      <w:pPr>
+        <w:rPr>
+          <w:lang w:val="en-US"/>
+        </w:rPr>
+      </w:pPr>
+      <w:r>
+        <w:rPr>
+          <w:lang w:val="en-US"/>
+        </w:rPr>
+        <w:t>cd programovanie-2026</w:t>
+      </w:r>
+    </w:p>
+    <w:p>
+      <w:pPr>
+        <w:rPr>
+          <w:lang w:val="en-US"/>
+        </w:rPr>
+      </w:pPr>
+      <w:r>
+        <w:rPr>
+          <w:lang w:val="en-US"/>
+        </w:rPr>
         <w:lastRenderedPageBreak/>
-        <w:t>V termináli:</w:t>
-      </w:r>
-    </w:p>
-    <w:p>
-      <w:pPr>
-        <w:rPr>
-          <w:lang w:val="en-US"/>
-        </w:rPr>
-      </w:pPr>
-      <w:r>
-        <w:rPr>
-          <w:lang w:val="en-US"/>
-        </w:rPr>
-        <w:t>bash</w:t>
-      </w:r>
-    </w:p>
-    <w:p>
-      <w:pPr>
-        <w:rPr>
-          <w:lang w:val="en-US"/>
-        </w:rPr>
-      </w:pPr>
-      <w:r>
-        <w:rPr>
-          <w:lang w:val="en-US"/>
-        </w:rPr>
-        <w:t>git clone https://github.com/tibor/programovanie-2026.git</w:t>
-      </w:r>
-    </w:p>
-    <w:p>
-      <w:pPr>
-        <w:rPr>
-          <w:lang w:val="en-US"/>
-        </w:rPr>
-      </w:pPr>
-      <w:r>
-        <w:rPr>
-          <w:lang w:val="en-US"/>
-        </w:rPr>
-        <w:t>cd programovanie-2026</w:t>
-      </w:r>
-    </w:p>
-    <w:p>
-      <w:pPr>
-        <w:rPr>
-          <w:lang w:val="en-US"/>
-        </w:rPr>
-      </w:pPr>
-      <w:r>
-        <w:rPr>
-          <w:lang w:val="en-US"/>
-        </w:rPr>
         <w:t xml:space="preserve">Alebo vo VS Code: </w:t>
       </w:r>
       <w:r>
@@ -5176,7 +4956,7 @@
           <w:lang w:val="en-US"/>
         </w:rPr>
       </w:pPr>
-      <w:bookmarkStart w:id="10" w:name="_Toc242292783"/>
+      <w:bookmarkStart w:id="11" w:name="_Toc242292783"/>
       <w:r>
         <w:rPr>
           <w:lang w:val="en-US"/>
@@ -5190,7 +4970,7 @@
         <w:noBreakHyphen/>
         <w:t>mailu (ak ešte nemá)</w:t>
       </w:r>
-      <w:bookmarkEnd w:id="10"/>
+      <w:bookmarkEnd w:id="11"/>
     </w:p>
     <w:p>
       <w:pPr>
@@ -5238,44 +5018,14 @@
           <w:lang w:val="en-US"/>
         </w:rPr>
       </w:pPr>
-      <w:bookmarkStart w:id="11" w:name="_Toc242292784"/>
-      <w:proofErr w:type="spellStart"/>
-      <w:r>
-        <w:rPr>
-          <w:lang w:val="en-US"/>
-        </w:rPr>
-        <w:t>Zadanie</w:t>
-      </w:r>
-      <w:proofErr w:type="spellEnd"/>
-      <w:r>
-        <w:rPr>
-          <w:lang w:val="en-US"/>
-        </w:rPr>
-        <w:t xml:space="preserve"> </w:t>
-      </w:r>
-      <w:proofErr w:type="spellStart"/>
-      <w:r>
-        <w:rPr>
-          <w:lang w:val="en-US"/>
-        </w:rPr>
-        <w:t>úlohy</w:t>
-      </w:r>
-      <w:proofErr w:type="spellEnd"/>
-      <w:r>
-        <w:rPr>
-          <w:lang w:val="en-US"/>
-        </w:rPr>
-        <w:t xml:space="preserve"> – </w:t>
-      </w:r>
-      <w:proofErr w:type="spellStart"/>
-      <w:r>
-        <w:rPr>
-          <w:lang w:val="en-US"/>
-        </w:rPr>
-        <w:t>učiteľ</w:t>
-      </w:r>
-      <w:bookmarkEnd w:id="11"/>
-      <w:proofErr w:type="spellEnd"/>
+      <w:bookmarkStart w:id="12" w:name="_Toc242292784"/>
+      <w:r>
+        <w:rPr>
+          <w:lang w:val="en-US"/>
+        </w:rPr>
+        <w:t>Zadanie úlohy – učiteľ</w:t>
+      </w:r>
+      <w:bookmarkEnd w:id="12"/>
     </w:p>
     <w:p>
       <w:pPr>
@@ -5297,36 +5047,14 @@
           <w:lang w:val="en-US"/>
         </w:rPr>
       </w:pPr>
-      <w:bookmarkStart w:id="12" w:name="_Toc242292785"/>
-      <w:r>
-        <w:rPr>
-          <w:lang w:val="en-US"/>
-        </w:rPr>
-        <w:t xml:space="preserve">Issue </w:t>
-      </w:r>
-      <w:proofErr w:type="spellStart"/>
-      <w:r>
-        <w:rPr>
-          <w:lang w:val="en-US"/>
-        </w:rPr>
-        <w:t>ako</w:t>
-      </w:r>
-      <w:proofErr w:type="spellEnd"/>
-      <w:r>
-        <w:rPr>
-          <w:lang w:val="en-US"/>
-        </w:rPr>
-        <w:t xml:space="preserve"> </w:t>
-      </w:r>
-      <w:proofErr w:type="spellStart"/>
-      <w:r>
-        <w:rPr>
-          <w:lang w:val="en-US"/>
-        </w:rPr>
-        <w:t>zadanie</w:t>
-      </w:r>
-      <w:bookmarkEnd w:id="12"/>
-      <w:proofErr w:type="spellEnd"/>
+      <w:bookmarkStart w:id="13" w:name="_Toc242292785"/>
+      <w:r>
+        <w:rPr>
+          <w:lang w:val="en-US"/>
+        </w:rPr>
+        <w:t>Issue ako zadanie</w:t>
+      </w:r>
+      <w:bookmarkEnd w:id="13"/>
     </w:p>
     <w:p>
       <w:pPr>
@@ -5648,50 +5376,14 @@
           <w:lang w:val="en-US"/>
         </w:rPr>
       </w:pPr>
-      <w:bookmarkStart w:id="13" w:name="_Toc242292786"/>
-      <w:proofErr w:type="spellStart"/>
-      <w:r>
-        <w:rPr>
-          <w:lang w:val="en-US"/>
-        </w:rPr>
-        <w:t>Práca</w:t>
-      </w:r>
-      <w:proofErr w:type="spellEnd"/>
-      <w:r>
-        <w:rPr>
-          <w:lang w:val="en-US"/>
-        </w:rPr>
-        <w:t xml:space="preserve"> </w:t>
-      </w:r>
-      <w:proofErr w:type="spellStart"/>
-      <w:r>
-        <w:rPr>
-          <w:lang w:val="en-US"/>
-        </w:rPr>
-        <w:t>na</w:t>
-      </w:r>
-      <w:proofErr w:type="spellEnd"/>
-      <w:r>
-        <w:rPr>
-          <w:lang w:val="en-US"/>
-        </w:rPr>
-        <w:t xml:space="preserve"> </w:t>
-      </w:r>
-      <w:proofErr w:type="spellStart"/>
-      <w:r>
-        <w:rPr>
-          <w:lang w:val="en-US"/>
-        </w:rPr>
-        <w:t>úlohe</w:t>
-      </w:r>
-      <w:proofErr w:type="spellEnd"/>
-      <w:r>
-        <w:rPr>
-          <w:lang w:val="en-US"/>
-        </w:rPr>
-        <w:t xml:space="preserve"> – študent (branch workflow)</w:t>
-      </w:r>
-      <w:bookmarkEnd w:id="13"/>
+      <w:bookmarkStart w:id="14" w:name="_Toc242292786"/>
+      <w:r>
+        <w:rPr>
+          <w:lang w:val="en-US"/>
+        </w:rPr>
+        <w:t>Práca na úlohe – študent (branch workflow)</w:t>
+      </w:r>
+      <w:bookmarkEnd w:id="14"/>
     </w:p>
     <w:p>
       <w:pPr>
@@ -5700,14 +5392,14 @@
           <w:lang w:val="en-US"/>
         </w:rPr>
       </w:pPr>
-      <w:bookmarkStart w:id="14" w:name="_Toc242292787"/>
+      <w:bookmarkStart w:id="15" w:name="_Toc242292787"/>
       <w:r>
         <w:rPr>
           <w:lang w:val="en-US"/>
         </w:rPr>
         <w:t>1. Vytvorenie vlastnej vetvy (branch)</w:t>
       </w:r>
-      <w:bookmarkEnd w:id="14"/>
+      <w:bookmarkEnd w:id="15"/>
     </w:p>
     <w:p>
       <w:pPr>
@@ -5794,15 +5486,14 @@
           <w:lang w:val="en-US"/>
         </w:rPr>
       </w:pPr>
-      <w:bookmarkStart w:id="15" w:name="_Toc242292788"/>
-      <w:r>
-        <w:rPr>
-          <w:lang w:val="en-US"/>
-        </w:rPr>
-        <w:lastRenderedPageBreak/>
+      <w:bookmarkStart w:id="16" w:name="_Toc242292788"/>
+      <w:r>
+        <w:rPr>
+          <w:lang w:val="en-US"/>
+        </w:rPr>
         <w:t>2. Implementácia riešenia</w:t>
       </w:r>
-      <w:bookmarkEnd w:id="15"/>
+      <w:bookmarkEnd w:id="16"/>
     </w:p>
     <w:p>
       <w:pPr>
@@ -5865,14 +5556,15 @@
           <w:lang w:val="en-US"/>
         </w:rPr>
       </w:pPr>
-      <w:bookmarkStart w:id="16" w:name="_Toc242292789"/>
-      <w:r>
-        <w:rPr>
-          <w:lang w:val="en-US"/>
-        </w:rPr>
+      <w:bookmarkStart w:id="17" w:name="_Toc242292789"/>
+      <w:r>
+        <w:rPr>
+          <w:lang w:val="en-US"/>
+        </w:rPr>
+        <w:lastRenderedPageBreak/>
         <w:t>3. Commitovanie zmien</w:t>
       </w:r>
-      <w:bookmarkEnd w:id="16"/>
+      <w:bookmarkEnd w:id="17"/>
     </w:p>
     <w:p>
       <w:pPr>
@@ -6027,36 +5719,14 @@
           <w:lang w:val="en-US"/>
         </w:rPr>
       </w:pPr>
-      <w:bookmarkStart w:id="17" w:name="_Toc242292790"/>
-      <w:proofErr w:type="spellStart"/>
-      <w:r>
-        <w:rPr>
-          <w:lang w:val="en-US"/>
-        </w:rPr>
-        <w:t>Odovzdanie</w:t>
-      </w:r>
-      <w:proofErr w:type="spellEnd"/>
-      <w:r>
-        <w:rPr>
-          <w:lang w:val="en-US"/>
-        </w:rPr>
-        <w:t xml:space="preserve"> </w:t>
-      </w:r>
-      <w:proofErr w:type="spellStart"/>
-      <w:r>
-        <w:rPr>
-          <w:lang w:val="en-US"/>
-        </w:rPr>
-        <w:t>úlohy</w:t>
-      </w:r>
-      <w:proofErr w:type="spellEnd"/>
-      <w:r>
-        <w:rPr>
-          <w:lang w:val="en-US"/>
-        </w:rPr>
-        <w:t xml:space="preserve"> – Pull Request (študent)</w:t>
-      </w:r>
-      <w:bookmarkEnd w:id="17"/>
+      <w:bookmarkStart w:id="18" w:name="_Toc242292790"/>
+      <w:r>
+        <w:rPr>
+          <w:lang w:val="en-US"/>
+        </w:rPr>
+        <w:t>Odovzdanie úlohy – Pull Request (študent)</w:t>
+      </w:r>
+      <w:bookmarkEnd w:id="18"/>
     </w:p>
     <w:p>
       <w:pPr>
@@ -6065,14 +5735,14 @@
           <w:lang w:val="en-US"/>
         </w:rPr>
       </w:pPr>
-      <w:bookmarkStart w:id="18" w:name="_Toc242292791"/>
+      <w:bookmarkStart w:id="19" w:name="_Toc242292791"/>
       <w:r>
         <w:rPr>
           <w:lang w:val="en-US"/>
         </w:rPr>
         <w:t>1. Vytvorenie Pull Requestu</w:t>
       </w:r>
-      <w:bookmarkEnd w:id="18"/>
+      <w:bookmarkEnd w:id="19"/>
     </w:p>
     <w:p>
       <w:pPr>
@@ -6200,14 +5870,14 @@
           <w:lang w:val="en-US"/>
         </w:rPr>
       </w:pPr>
-      <w:bookmarkStart w:id="19" w:name="_Toc242292792"/>
+      <w:bookmarkStart w:id="20" w:name="_Toc242292792"/>
       <w:r>
         <w:rPr>
           <w:lang w:val="en-US"/>
         </w:rPr>
         <w:t>2. Vyplnenie PR</w:t>
       </w:r>
-      <w:bookmarkEnd w:id="19"/>
+      <w:bookmarkEnd w:id="20"/>
     </w:p>
     <w:p>
       <w:pPr>
@@ -6397,70 +6067,26 @@
           <w:lang w:val="en-US"/>
         </w:rPr>
       </w:pPr>
-      <w:bookmarkStart w:id="20" w:name="_Toc242292793"/>
-      <w:proofErr w:type="spellStart"/>
-      <w:r>
-        <w:rPr>
-          <w:lang w:val="en-US"/>
-        </w:rPr>
-        <w:t>Kontrola</w:t>
-      </w:r>
-      <w:proofErr w:type="spellEnd"/>
-      <w:r>
-        <w:rPr>
-          <w:lang w:val="en-US"/>
-        </w:rPr>
-        <w:t xml:space="preserve"> </w:t>
-      </w:r>
-      <w:proofErr w:type="spellStart"/>
-      <w:r>
-        <w:rPr>
-          <w:lang w:val="en-US"/>
-        </w:rPr>
-        <w:t>riešenia</w:t>
-      </w:r>
-      <w:proofErr w:type="spellEnd"/>
-      <w:r>
-        <w:rPr>
-          <w:lang w:val="en-US"/>
-        </w:rPr>
-        <w:t xml:space="preserve"> – </w:t>
-      </w:r>
-      <w:proofErr w:type="spellStart"/>
-      <w:r>
-        <w:rPr>
-          <w:lang w:val="en-US"/>
-        </w:rPr>
-        <w:t>učiteľ</w:t>
-      </w:r>
-      <w:proofErr w:type="spellEnd"/>
-      <w:r>
-        <w:rPr>
-          <w:lang w:val="en-US"/>
-        </w:rPr>
-        <w:t xml:space="preserve"> (code review)</w:t>
-      </w:r>
-      <w:bookmarkEnd w:id="20"/>
-    </w:p>
-    <w:p>
-      <w:pPr>
-        <w:rPr>
-          <w:lang w:val="en-US"/>
-        </w:rPr>
-      </w:pPr>
-      <w:proofErr w:type="spellStart"/>
-      <w:r>
-        <w:rPr>
-          <w:lang w:val="en-US"/>
-        </w:rPr>
-        <w:t>Učiteľ</w:t>
-      </w:r>
-      <w:proofErr w:type="spellEnd"/>
-      <w:r>
-        <w:rPr>
-          <w:lang w:val="en-US"/>
-        </w:rPr>
-        <w:t>:</w:t>
+      <w:bookmarkStart w:id="21" w:name="_Toc242292793"/>
+      <w:r>
+        <w:rPr>
+          <w:lang w:val="en-US"/>
+        </w:rPr>
+        <w:t>Kontrola riešenia – učiteľ (code review)</w:t>
+      </w:r>
+      <w:bookmarkEnd w:id="21"/>
+    </w:p>
+    <w:p>
+      <w:pPr>
+        <w:rPr>
+          <w:lang w:val="en-US"/>
+        </w:rPr>
+      </w:pPr>
+      <w:r>
+        <w:rPr>
+          <w:lang w:val="en-US"/>
+        </w:rPr>
+        <w:t>Učiteľ:</w:t>
       </w:r>
     </w:p>
     <w:p>
@@ -6470,14 +6096,14 @@
           <w:lang w:val="en-US"/>
         </w:rPr>
       </w:pPr>
-      <w:bookmarkStart w:id="21" w:name="_Toc242292794"/>
+      <w:bookmarkStart w:id="22" w:name="_Toc242292794"/>
       <w:r>
         <w:rPr>
           <w:lang w:val="en-US"/>
         </w:rPr>
         <w:t>1. Otvorí Pull Request</w:t>
       </w:r>
-      <w:bookmarkEnd w:id="21"/>
+      <w:bookmarkEnd w:id="22"/>
     </w:p>
     <w:p>
       <w:pPr>
@@ -6511,15 +6137,14 @@
           <w:lang w:val="en-US"/>
         </w:rPr>
       </w:pPr>
-      <w:bookmarkStart w:id="22" w:name="_Toc242292795"/>
-      <w:r>
-        <w:rPr>
-          <w:lang w:val="en-US"/>
-        </w:rPr>
-        <w:lastRenderedPageBreak/>
+      <w:bookmarkStart w:id="23" w:name="_Toc242292795"/>
+      <w:r>
+        <w:rPr>
+          <w:lang w:val="en-US"/>
+        </w:rPr>
         <w:t>2. Prejde zmeny</w:t>
       </w:r>
-      <w:bookmarkEnd w:id="22"/>
+      <w:bookmarkEnd w:id="23"/>
     </w:p>
     <w:p>
       <w:pPr>
@@ -6570,14 +6195,15 @@
           <w:lang w:val="en-US"/>
         </w:rPr>
       </w:pPr>
-      <w:bookmarkStart w:id="23" w:name="_Toc242292796"/>
-      <w:r>
-        <w:rPr>
-          <w:lang w:val="en-US"/>
-        </w:rPr>
+      <w:bookmarkStart w:id="24" w:name="_Toc242292796"/>
+      <w:r>
+        <w:rPr>
+          <w:lang w:val="en-US"/>
+        </w:rPr>
+        <w:lastRenderedPageBreak/>
         <w:t>3. Pridá komentáre</w:t>
       </w:r>
-      <w:bookmarkEnd w:id="23"/>
+      <w:bookmarkEnd w:id="24"/>
     </w:p>
     <w:p>
       <w:pPr>
@@ -6641,14 +6267,14 @@
           <w:lang w:val="en-US"/>
         </w:rPr>
       </w:pPr>
-      <w:bookmarkStart w:id="24" w:name="_Toc242292797"/>
+      <w:bookmarkStart w:id="25" w:name="_Toc242292797"/>
       <w:r>
         <w:rPr>
           <w:lang w:val="en-US"/>
         </w:rPr>
         <w:t>4. Celkové hodnotenie</w:t>
       </w:r>
-      <w:bookmarkEnd w:id="24"/>
+      <w:bookmarkEnd w:id="25"/>
     </w:p>
     <w:p>
       <w:pPr>
@@ -6763,50 +6389,14 @@
           <w:lang w:val="en-US"/>
         </w:rPr>
       </w:pPr>
-      <w:bookmarkStart w:id="25" w:name="_Toc242292798"/>
-      <w:proofErr w:type="spellStart"/>
-      <w:r>
-        <w:rPr>
-          <w:lang w:val="en-US"/>
-        </w:rPr>
-        <w:t>Úpravy</w:t>
-      </w:r>
-      <w:proofErr w:type="spellEnd"/>
-      <w:r>
-        <w:rPr>
-          <w:lang w:val="en-US"/>
-        </w:rPr>
-        <w:t xml:space="preserve"> </w:t>
-      </w:r>
-      <w:proofErr w:type="spellStart"/>
-      <w:r>
-        <w:rPr>
-          <w:lang w:val="en-US"/>
-        </w:rPr>
-        <w:t>podľa</w:t>
-      </w:r>
-      <w:proofErr w:type="spellEnd"/>
-      <w:r>
-        <w:rPr>
-          <w:lang w:val="en-US"/>
-        </w:rPr>
-        <w:t xml:space="preserve"> </w:t>
-      </w:r>
-      <w:proofErr w:type="spellStart"/>
-      <w:r>
-        <w:rPr>
-          <w:lang w:val="en-US"/>
-        </w:rPr>
-        <w:t>pripomienok</w:t>
-      </w:r>
-      <w:proofErr w:type="spellEnd"/>
-      <w:r>
-        <w:rPr>
-          <w:lang w:val="en-US"/>
-        </w:rPr>
-        <w:t xml:space="preserve"> – študent</w:t>
-      </w:r>
-      <w:bookmarkEnd w:id="25"/>
+      <w:bookmarkStart w:id="26" w:name="_Toc242292798"/>
+      <w:r>
+        <w:rPr>
+          <w:lang w:val="en-US"/>
+        </w:rPr>
+        <w:t>Úpravy podľa pripomienok – študent</w:t>
+      </w:r>
+      <w:bookmarkEnd w:id="26"/>
     </w:p>
     <w:p>
       <w:pPr>
@@ -6927,36 +6517,14 @@
           <w:lang w:val="en-US"/>
         </w:rPr>
       </w:pPr>
-      <w:bookmarkStart w:id="26" w:name="_Toc242292799"/>
-      <w:r>
-        <w:rPr>
-          <w:lang w:val="en-US"/>
-        </w:rPr>
-        <w:t xml:space="preserve">Merge </w:t>
-      </w:r>
-      <w:proofErr w:type="spellStart"/>
-      <w:r>
-        <w:rPr>
-          <w:lang w:val="en-US"/>
-        </w:rPr>
-        <w:t>do main</w:t>
-      </w:r>
-      <w:proofErr w:type="spellEnd"/>
-      <w:r>
-        <w:rPr>
-          <w:lang w:val="en-US"/>
-        </w:rPr>
-        <w:t xml:space="preserve"> – </w:t>
-      </w:r>
-      <w:proofErr w:type="spellStart"/>
-      <w:r>
-        <w:rPr>
-          <w:lang w:val="en-US"/>
-        </w:rPr>
-        <w:t>učiteľ</w:t>
-      </w:r>
-      <w:bookmarkEnd w:id="26"/>
-      <w:proofErr w:type="spellEnd"/>
+      <w:bookmarkStart w:id="27" w:name="_Toc242292799"/>
+      <w:r>
+        <w:rPr>
+          <w:lang w:val="en-US"/>
+        </w:rPr>
+        <w:t>Merge do main – učiteľ</w:t>
+      </w:r>
+      <w:bookmarkEnd w:id="27"/>
     </w:p>
     <w:p>
       <w:pPr>
@@ -7072,64 +6640,14 @@
           <w:lang w:val="en-US"/>
         </w:rPr>
       </w:pPr>
-      <w:bookmarkStart w:id="27" w:name="_Toc242292800"/>
-      <w:proofErr w:type="spellStart"/>
-      <w:r>
-        <w:rPr>
-          <w:lang w:val="en-US"/>
-        </w:rPr>
-        <w:t>Ochrana</w:t>
-      </w:r>
-      <w:proofErr w:type="spellEnd"/>
-      <w:r>
-        <w:rPr>
-          <w:lang w:val="en-US"/>
-        </w:rPr>
-        <w:t xml:space="preserve"> </w:t>
-      </w:r>
-      <w:proofErr w:type="spellStart"/>
-      <w:r>
-        <w:rPr>
-          <w:lang w:val="en-US"/>
-        </w:rPr>
-        <w:t>hlavnej</w:t>
-      </w:r>
-      <w:proofErr w:type="spellEnd"/>
-      <w:r>
-        <w:rPr>
-          <w:lang w:val="en-US"/>
-        </w:rPr>
-        <w:t xml:space="preserve"> </w:t>
-      </w:r>
-      <w:proofErr w:type="spellStart"/>
-      <w:r>
-        <w:rPr>
-          <w:lang w:val="en-US"/>
-        </w:rPr>
-        <w:t>vetvy</w:t>
-      </w:r>
-      <w:proofErr w:type="spellEnd"/>
-      <w:r>
-        <w:rPr>
-          <w:lang w:val="en-US"/>
-        </w:rPr>
-        <w:t xml:space="preserve"> – </w:t>
-      </w:r>
-      <w:proofErr w:type="spellStart"/>
-      <w:r>
-        <w:rPr>
-          <w:lang w:val="en-US"/>
-        </w:rPr>
-        <w:t>učiteľ</w:t>
-      </w:r>
-      <w:proofErr w:type="spellEnd"/>
-      <w:r>
-        <w:rPr>
-          <w:lang w:val="en-US"/>
-        </w:rPr>
-        <w:t xml:space="preserve"> (odporúčané)</w:t>
-      </w:r>
-      <w:bookmarkEnd w:id="27"/>
+      <w:bookmarkStart w:id="28" w:name="_Toc242292800"/>
+      <w:r>
+        <w:rPr>
+          <w:lang w:val="en-US"/>
+        </w:rPr>
+        <w:t>Ochrana hlavnej vetvy – učiteľ (odporúčané)</w:t>
+      </w:r>
+      <w:bookmarkEnd w:id="28"/>
     </w:p>
     <w:p>
       <w:pPr>
@@ -7294,54 +6812,26 @@
           <w:lang w:val="en-US"/>
         </w:rPr>
       </w:pPr>
-      <w:bookmarkStart w:id="28" w:name="_Toc242292801"/>
-      <w:r>
-        <w:rPr>
-          <w:lang w:val="en-US"/>
-        </w:rPr>
-        <w:t xml:space="preserve">Bonus: Live </w:t>
-      </w:r>
-      <w:proofErr w:type="spellStart"/>
-      <w:r>
-        <w:rPr>
-          <w:lang w:val="en-US"/>
-        </w:rPr>
-        <w:t>spolupráca</w:t>
-      </w:r>
-      <w:proofErr w:type="spellEnd"/>
-      <w:r>
-        <w:rPr>
-          <w:lang w:val="en-US"/>
-        </w:rPr>
-        <w:t xml:space="preserve"> (VS Code Live Share)</w:t>
-      </w:r>
-      <w:bookmarkEnd w:id="28"/>
-    </w:p>
-    <w:p>
-      <w:pPr>
-        <w:rPr>
-          <w:lang w:val="en-US"/>
-        </w:rPr>
-      </w:pPr>
-      <w:r>
-        <w:rPr>
-          <w:lang w:val="en-US"/>
-        </w:rPr>
-        <w:t>Ak chceš so študentom pracovať „</w:t>
-      </w:r>
-      <w:proofErr w:type="gramStart"/>
-      <w:r>
-        <w:rPr>
-          <w:lang w:val="en-US"/>
-        </w:rPr>
-        <w:t>naživo“</w:t>
-      </w:r>
-      <w:proofErr w:type="gramEnd"/>
-      <w:r>
-        <w:rPr>
-          <w:lang w:val="en-US"/>
-        </w:rPr>
-        <w:t>:</w:t>
+      <w:bookmarkStart w:id="29" w:name="_Toc242292801"/>
+      <w:r>
+        <w:rPr>
+          <w:lang w:val="en-US"/>
+        </w:rPr>
+        <w:t>Bonus: Live spolupráca (VS Code Live Share)</w:t>
+      </w:r>
+      <w:bookmarkEnd w:id="29"/>
+    </w:p>
+    <w:p>
+      <w:pPr>
+        <w:rPr>
+          <w:lang w:val="en-US"/>
+        </w:rPr>
+      </w:pPr>
+      <w:r>
+        <w:rPr>
+          <w:lang w:val="en-US"/>
+        </w:rPr>
+        <w:t>Ak chceš so študentom pracovať „naživo“:</w:t>
       </w:r>
     </w:p>
     <w:p>
@@ -7358,7 +6848,6 @@
         <w:rPr>
           <w:lang w:val="en-US"/>
         </w:rPr>
-        <w:lastRenderedPageBreak/>
         <w:t xml:space="preserve">Obaja používate </w:t>
       </w:r>
       <w:r>
@@ -7446,6 +6935,7 @@
         <w:rPr>
           <w:lang w:val="en-US"/>
         </w:rPr>
+        <w:lastRenderedPageBreak/>
         <w:t>pošle študentovi odkaz</w:t>
       </w:r>
     </w:p>
@@ -7523,14 +7013,14 @@
           <w:lang w:val="en-US"/>
         </w:rPr>
       </w:pPr>
-      <w:bookmarkStart w:id="29" w:name="_Toc242292802"/>
+      <w:bookmarkStart w:id="30" w:name="_Toc242292802"/>
       <w:r>
         <w:rPr>
           <w:lang w:val="en-US"/>
         </w:rPr>
         <w:t>Zhrnutie – kompletný workflow</w:t>
       </w:r>
-      <w:bookmarkEnd w:id="29"/>
+      <w:bookmarkEnd w:id="30"/>
     </w:p>
     <w:p>
       <w:pPr>

</xml_diff>